<commit_message>
Terraform Task 1 - updated
</commit_message>
<xml_diff>
--- a/Terraform Task - 1.docx
+++ b/Terraform Task - 1.docx
@@ -2,6 +2,362 @@
 <file path=word/document.xml><?xml version="1.0" encoding="utf-8"?>
 <w:document xmlns:wpc="http://schemas.microsoft.com/office/word/2010/wordprocessingCanvas" xmlns:cx="http://schemas.microsoft.com/office/drawing/2014/chartex" xmlns:cx1="http://schemas.microsoft.com/office/drawing/2015/9/8/chartex" xmlns:cx2="http://schemas.microsoft.com/office/drawing/2015/10/21/chartex" xmlns:cx3="http://schemas.microsoft.com/office/drawing/2016/5/9/chartex" xmlns:cx4="http://schemas.microsoft.com/office/drawing/2016/5/10/chartex" xmlns:cx5="http://schemas.microsoft.com/office/drawing/2016/5/11/chartex" xmlns:cx6="http://schemas.microsoft.com/office/drawing/2016/5/12/chartex" xmlns:cx7="http://schemas.microsoft.com/office/drawing/2016/5/13/chartex" xmlns:cx8="http://schemas.microsoft.com/office/drawing/2016/5/14/chartex" xmlns:mc="http://schemas.openxmlformats.org/markup-compatibility/2006" xmlns:aink="http://schemas.microsoft.com/office/drawing/2016/ink" xmlns:am3d="http://schemas.microsoft.com/office/drawing/2017/model3d" xmlns:o="urn:schemas-microsoft-com:office:office" xmlns:oel="http://schemas.microsoft.com/office/2019/extlst" xmlns:r="http://schemas.openxmlformats.org/officeDocument/2006/relationships" xmlns:m="http://schemas.openxmlformats.org/officeDocument/2006/math" xmlns:v="urn:schemas-microsoft-com:vml" xmlns:wp14="http://schemas.microsoft.com/office/word/2010/wordprocessingDrawing" xmlns:wp="http://schemas.openxmlformats.org/drawingml/2006/wordprocessingDrawing" xmlns:w10="urn:schemas-microsoft-com:office:word" xmlns:w="http://schemas.openxmlformats.org/wordprocessingml/2006/main" xmlns:w14="http://schemas.microsoft.com/office/word/2010/wordml" xmlns:w15="http://schemas.microsoft.com/office/word/2012/wordml" xmlns:w16cex="http://schemas.microsoft.com/office/word/2018/wordml/cex" xmlns:w16cid="http://schemas.microsoft.com/office/word/2016/wordml/cid" xmlns:w16="http://schemas.microsoft.com/office/word/2018/wordml" xmlns:w16du="http://schemas.microsoft.com/office/word/2023/wordml/word16du" xmlns:w16sdtdh="http://schemas.microsoft.com/office/word/2020/wordml/sdtdatahash" xmlns:w16sdtfl="http://schemas.microsoft.com/office/word/2024/wordml/sdtformatlock" xmlns:w16se="http://schemas.microsoft.com/office/word/2015/wordml/symex" xmlns:wpg="http://schemas.microsoft.com/office/word/2010/wordprocessingGroup" xmlns:wpi="http://schemas.microsoft.com/office/word/2010/wordprocessingInk" xmlns:wne="http://schemas.microsoft.com/office/word/2006/wordml" xmlns:wps="http://schemas.microsoft.com/office/word/2010/wordprocessingShape" mc:Ignorable="w14 w15 w16se w16cid w16 w16cex w16sdtdh w16sdtfl w16du wp14">
   <w:body>
+    <w:p>
+      <w:pPr>
+        <w:rPr>
+          <w:b/>
+          <w:bCs/>
+        </w:rPr>
+      </w:pPr>
+      <w:r>
+        <w:rPr>
+          <w:b/>
+          <w:bCs/>
+        </w:rPr>
+        <w:t>Terraform Task Summary</w:t>
+      </w:r>
+    </w:p>
+    <w:p>
+      <w:pPr>
+        <w:rPr>
+          <w:b/>
+          <w:bCs/>
+        </w:rPr>
+      </w:pPr>
+      <w:r>
+        <w:rPr>
+          <w:b/>
+          <w:bCs/>
+        </w:rPr>
+        <w:t>Objective</w:t>
+      </w:r>
+    </w:p>
+    <w:p>
+      <w:r>
+        <w:t>Provision Linux EC2 instances in two different AWS regions using a single Terraform configuration file.</w:t>
+      </w:r>
+    </w:p>
+    <w:p>
+      <w:pPr>
+        <w:rPr>
+          <w:b/>
+          <w:bCs/>
+        </w:rPr>
+      </w:pPr>
+      <w:r>
+        <w:rPr>
+          <w:b/>
+          <w:bCs/>
+        </w:rPr>
+        <w:t>Technologies Used</w:t>
+      </w:r>
+    </w:p>
+    <w:p>
+      <w:pPr>
+        <w:numPr>
+          <w:ilvl w:val="0"/>
+          <w:numId w:val="1"/>
+        </w:numPr>
+      </w:pPr>
+      <w:r>
+        <w:t>AWS EC2</w:t>
+      </w:r>
+    </w:p>
+    <w:p>
+      <w:pPr>
+        <w:numPr>
+          <w:ilvl w:val="0"/>
+          <w:numId w:val="1"/>
+        </w:numPr>
+      </w:pPr>
+      <w:r>
+        <w:t>AWS CLI</w:t>
+      </w:r>
+    </w:p>
+    <w:p>
+      <w:pPr>
+        <w:numPr>
+          <w:ilvl w:val="0"/>
+          <w:numId w:val="1"/>
+        </w:numPr>
+      </w:pPr>
+      <w:r>
+        <w:t>Terraform</w:t>
+      </w:r>
+    </w:p>
+    <w:p>
+      <w:pPr>
+        <w:rPr>
+          <w:b/>
+          <w:bCs/>
+        </w:rPr>
+      </w:pPr>
+      <w:r>
+        <w:rPr>
+          <w:b/>
+          <w:bCs/>
+        </w:rPr>
+        <w:t>Steps Performed</w:t>
+      </w:r>
+    </w:p>
+    <w:p>
+      <w:pPr>
+        <w:numPr>
+          <w:ilvl w:val="0"/>
+          <w:numId w:val="2"/>
+        </w:numPr>
+      </w:pPr>
+      <w:r>
+        <w:t>Installed and configured AWS CLI with IAM credentials.</w:t>
+      </w:r>
+    </w:p>
+    <w:p>
+      <w:pPr>
+        <w:numPr>
+          <w:ilvl w:val="0"/>
+          <w:numId w:val="2"/>
+        </w:numPr>
+      </w:pPr>
+      <w:r>
+        <w:t>Installed Terraform on Windows and configured the environment.</w:t>
+      </w:r>
+    </w:p>
+    <w:p>
+      <w:pPr>
+        <w:numPr>
+          <w:ilvl w:val="0"/>
+          <w:numId w:val="2"/>
+        </w:numPr>
+      </w:pPr>
+      <w:r>
+        <w:t>Created a Terraform project with a single main.tf file.</w:t>
+      </w:r>
+    </w:p>
+    <w:p>
+      <w:pPr>
+        <w:numPr>
+          <w:ilvl w:val="0"/>
+          <w:numId w:val="2"/>
+        </w:numPr>
+      </w:pPr>
+      <w:r>
+        <w:t>Configured multiple AWS providers using aliases for:</w:t>
+      </w:r>
+    </w:p>
+    <w:p>
+      <w:pPr>
+        <w:numPr>
+          <w:ilvl w:val="1"/>
+          <w:numId w:val="2"/>
+        </w:numPr>
+      </w:pPr>
+      <w:r>
+        <w:t>Mumbai (ap-south-1)</w:t>
+      </w:r>
+    </w:p>
+    <w:p>
+      <w:pPr>
+        <w:numPr>
+          <w:ilvl w:val="1"/>
+          <w:numId w:val="2"/>
+        </w:numPr>
+      </w:pPr>
+      <w:r>
+        <w:t>N. Virginia (us-east-1)</w:t>
+      </w:r>
+    </w:p>
+    <w:p>
+      <w:pPr>
+        <w:numPr>
+          <w:ilvl w:val="0"/>
+          <w:numId w:val="2"/>
+        </w:numPr>
+      </w:pPr>
+      <w:r>
+        <w:t>Used Terraform data sources to fetch the latest Ubuntu 24.04 LTS AMI for each region.</w:t>
+      </w:r>
+    </w:p>
+    <w:p>
+      <w:pPr>
+        <w:numPr>
+          <w:ilvl w:val="0"/>
+          <w:numId w:val="2"/>
+        </w:numPr>
+      </w:pPr>
+      <w:r>
+        <w:t>Defined two EC2 instance resources in a single Terraform configuration.</w:t>
+      </w:r>
+    </w:p>
+    <w:p>
+      <w:pPr>
+        <w:numPr>
+          <w:ilvl w:val="0"/>
+          <w:numId w:val="2"/>
+        </w:numPr>
+      </w:pPr>
+      <w:r>
+        <w:t>Specified the subnet for the Mumbai instance and configured public IP assignment.</w:t>
+      </w:r>
+    </w:p>
+    <w:p>
+      <w:pPr>
+        <w:numPr>
+          <w:ilvl w:val="0"/>
+          <w:numId w:val="2"/>
+        </w:numPr>
+      </w:pPr>
+      <w:r>
+        <w:t>Executed Terraform commands:</w:t>
+      </w:r>
+    </w:p>
+    <w:p>
+      <w:pPr>
+        <w:numPr>
+          <w:ilvl w:val="1"/>
+          <w:numId w:val="2"/>
+        </w:numPr>
+      </w:pPr>
+      <w:r>
+        <w:t xml:space="preserve">terraform </w:t>
+      </w:r>
+      <w:proofErr w:type="spellStart"/>
+      <w:r>
+        <w:t>init</w:t>
+      </w:r>
+      <w:proofErr w:type="spellEnd"/>
+    </w:p>
+    <w:p>
+      <w:pPr>
+        <w:numPr>
+          <w:ilvl w:val="1"/>
+          <w:numId w:val="2"/>
+        </w:numPr>
+      </w:pPr>
+      <w:r>
+        <w:t>terraform validate</w:t>
+      </w:r>
+    </w:p>
+    <w:p>
+      <w:pPr>
+        <w:numPr>
+          <w:ilvl w:val="1"/>
+          <w:numId w:val="2"/>
+        </w:numPr>
+      </w:pPr>
+      <w:r>
+        <w:t>terraform plan</w:t>
+      </w:r>
+    </w:p>
+    <w:p>
+      <w:pPr>
+        <w:numPr>
+          <w:ilvl w:val="1"/>
+          <w:numId w:val="2"/>
+        </w:numPr>
+      </w:pPr>
+      <w:r>
+        <w:t>terraform apply</w:t>
+      </w:r>
+    </w:p>
+    <w:p>
+      <w:pPr>
+        <w:numPr>
+          <w:ilvl w:val="0"/>
+          <w:numId w:val="2"/>
+        </w:numPr>
+      </w:pPr>
+      <w:r>
+        <w:t>Successfully provisioned one Ubuntu EC2 instance in Mumbai and one Ubuntu EC2 instance in N. Virginia.</w:t>
+      </w:r>
+    </w:p>
+    <w:p>
+      <w:pPr>
+        <w:numPr>
+          <w:ilvl w:val="0"/>
+          <w:numId w:val="2"/>
+        </w:numPr>
+      </w:pPr>
+      <w:r>
+        <w:t xml:space="preserve">Verified both EC2 instances were in the </w:t>
+      </w:r>
+      <w:r>
+        <w:rPr>
+          <w:b/>
+          <w:bCs/>
+        </w:rPr>
+        <w:t>Running</w:t>
+      </w:r>
+      <w:r>
+        <w:t xml:space="preserve"> state from the AWS Management Console.</w:t>
+      </w:r>
+    </w:p>
+    <w:p>
+      <w:pPr>
+        <w:numPr>
+          <w:ilvl w:val="0"/>
+          <w:numId w:val="2"/>
+        </w:numPr>
+      </w:pPr>
+      <w:r>
+        <w:t>Cleaned up all resources using terraform destroy to avoid unnecessary AWS charges.</w:t>
+      </w:r>
+    </w:p>
+    <w:p>
+      <w:pPr>
+        <w:rPr>
+          <w:b/>
+          <w:bCs/>
+        </w:rPr>
+      </w:pPr>
+      <w:r>
+        <w:rPr>
+          <w:b/>
+          <w:bCs/>
+        </w:rPr>
+        <w:t>Outcome</w:t>
+      </w:r>
+    </w:p>
+    <w:p>
+      <w:pPr>
+        <w:numPr>
+          <w:ilvl w:val="0"/>
+          <w:numId w:val="3"/>
+        </w:numPr>
+      </w:pPr>
+      <w:r>
+        <w:t>Successfully deployed Linux EC2 instances in two AWS regions using a single Terraform file.</w:t>
+      </w:r>
+    </w:p>
+    <w:p>
+      <w:pPr>
+        <w:numPr>
+          <w:ilvl w:val="0"/>
+          <w:numId w:val="3"/>
+        </w:numPr>
+      </w:pPr>
+      <w:r>
+        <w:t>Demonstrated Infrastructure as Code (</w:t>
+      </w:r>
+      <w:proofErr w:type="spellStart"/>
+      <w:r>
+        <w:t>IaC</w:t>
+      </w:r>
+      <w:proofErr w:type="spellEnd"/>
+      <w:r>
+        <w:t>) by automating AWS resource provisioning.</w:t>
+      </w:r>
+    </w:p>
+    <w:p>
+      <w:pPr>
+        <w:numPr>
+          <w:ilvl w:val="0"/>
+          <w:numId w:val="3"/>
+        </w:numPr>
+      </w:pPr>
+      <w:r>
+        <w:t>Verified successful deployment and resource cleanup using Terraform.</w:t>
+      </w:r>
+    </w:p>
     <w:p/>
     <w:p/>
     <w:p/>
@@ -26,7 +382,7 @@
                     <pic:cNvPicPr/>
                   </pic:nvPicPr>
                   <pic:blipFill>
-                    <a:blip r:embed="rId4"/>
+                    <a:blip r:embed="rId5"/>
                     <a:stretch>
                       <a:fillRect/>
                     </a:stretch>
@@ -68,7 +424,7 @@
                     <pic:cNvPicPr/>
                   </pic:nvPicPr>
                   <pic:blipFill>
-                    <a:blip r:embed="rId5"/>
+                    <a:blip r:embed="rId6"/>
                     <a:stretch>
                       <a:fillRect/>
                     </a:stretch>
@@ -89,6 +445,9 @@
         </w:drawing>
       </w:r>
       <w:r>
+        <w:rPr>
+          <w:noProof/>
+        </w:rPr>
         <w:drawing>
           <wp:inline distT="0" distB="0" distL="0" distR="0" wp14:anchorId="7A3DDCC5" wp14:editId="324B6136">
             <wp:extent cx="5029636" cy="655377"/>
@@ -105,7 +464,7 @@
                     <pic:cNvPicPr/>
                   </pic:nvPicPr>
                   <pic:blipFill>
-                    <a:blip r:embed="rId6"/>
+                    <a:blip r:embed="rId7"/>
                     <a:stretch>
                       <a:fillRect/>
                     </a:stretch>
@@ -129,6 +488,9 @@
     <w:p/>
     <w:p>
       <w:r>
+        <w:rPr>
+          <w:noProof/>
+        </w:rPr>
         <w:drawing>
           <wp:inline distT="0" distB="0" distL="0" distR="0" wp14:anchorId="6C9F69B0" wp14:editId="3A872A1A">
             <wp:extent cx="5731510" cy="2636520"/>
@@ -145,7 +507,7 @@
                     <pic:cNvPicPr/>
                   </pic:nvPicPr>
                   <pic:blipFill>
-                    <a:blip r:embed="rId7"/>
+                    <a:blip r:embed="rId8"/>
                     <a:stretch>
                       <a:fillRect/>
                     </a:stretch>
@@ -168,6 +530,9 @@
     </w:p>
     <w:p>
       <w:r>
+        <w:rPr>
+          <w:noProof/>
+        </w:rPr>
         <w:drawing>
           <wp:inline distT="0" distB="0" distL="0" distR="0" wp14:anchorId="5379C146" wp14:editId="7F6C5116">
             <wp:extent cx="5731510" cy="1319530"/>
@@ -184,7 +549,7 @@
                     <pic:cNvPicPr/>
                   </pic:nvPicPr>
                   <pic:blipFill>
-                    <a:blip r:embed="rId8"/>
+                    <a:blip r:embed="rId9"/>
                     <a:stretch>
                       <a:fillRect/>
                     </a:stretch>
@@ -207,6 +572,9 @@
     </w:p>
     <w:p>
       <w:r>
+        <w:rPr>
+          <w:noProof/>
+        </w:rPr>
         <w:lastRenderedPageBreak/>
         <w:drawing>
           <wp:inline distT="0" distB="0" distL="0" distR="0" wp14:anchorId="5552C7E7" wp14:editId="0F5F3D6B">
@@ -224,7 +592,7 @@
                     <pic:cNvPicPr/>
                   </pic:nvPicPr>
                   <pic:blipFill>
-                    <a:blip r:embed="rId9"/>
+                    <a:blip r:embed="rId10"/>
                     <a:stretch>
                       <a:fillRect/>
                     </a:stretch>
@@ -245,6 +613,9 @@
         </w:drawing>
       </w:r>
       <w:r>
+        <w:rPr>
+          <w:noProof/>
+        </w:rPr>
         <w:drawing>
           <wp:inline distT="0" distB="0" distL="0" distR="0" wp14:anchorId="7E331201" wp14:editId="050B9AFA">
             <wp:extent cx="5731510" cy="466725"/>
@@ -261,7 +632,7 @@
                     <pic:cNvPicPr/>
                   </pic:nvPicPr>
                   <pic:blipFill>
-                    <a:blip r:embed="rId10"/>
+                    <a:blip r:embed="rId11"/>
                     <a:stretch>
                       <a:fillRect/>
                     </a:stretch>
@@ -282,6 +653,9 @@
         </w:drawing>
       </w:r>
       <w:r>
+        <w:rPr>
+          <w:noProof/>
+        </w:rPr>
         <w:drawing>
           <wp:inline distT="0" distB="0" distL="0" distR="0" wp14:anchorId="15F95213" wp14:editId="664754C8">
             <wp:extent cx="5731510" cy="2599690"/>
@@ -298,7 +672,7 @@
                     <pic:cNvPicPr/>
                   </pic:nvPicPr>
                   <pic:blipFill>
-                    <a:blip r:embed="rId11"/>
+                    <a:blip r:embed="rId12"/>
                     <a:stretch>
                       <a:fillRect/>
                     </a:stretch>
@@ -321,6 +695,9 @@
     </w:p>
     <w:p>
       <w:r>
+        <w:rPr>
+          <w:noProof/>
+        </w:rPr>
         <w:drawing>
           <wp:inline distT="0" distB="0" distL="0" distR="0" wp14:anchorId="6C8F39C4" wp14:editId="1277D14E">
             <wp:extent cx="5731510" cy="1671955"/>
@@ -337,7 +714,7 @@
                     <pic:cNvPicPr/>
                   </pic:nvPicPr>
                   <pic:blipFill>
-                    <a:blip r:embed="rId12"/>
+                    <a:blip r:embed="rId13"/>
                     <a:stretch>
                       <a:fillRect/>
                     </a:stretch>
@@ -360,6 +737,9 @@
     </w:p>
     <w:p>
       <w:r>
+        <w:rPr>
+          <w:noProof/>
+        </w:rPr>
         <w:lastRenderedPageBreak/>
         <w:drawing>
           <wp:inline distT="0" distB="0" distL="0" distR="0" wp14:anchorId="2FB5EC60" wp14:editId="11A4A3D1">
@@ -377,7 +757,7 @@
                     <pic:cNvPicPr/>
                   </pic:nvPicPr>
                   <pic:blipFill>
-                    <a:blip r:embed="rId13"/>
+                    <a:blip r:embed="rId14"/>
                     <a:stretch>
                       <a:fillRect/>
                     </a:stretch>
@@ -398,6 +778,9 @@
         </w:drawing>
       </w:r>
       <w:r>
+        <w:rPr>
+          <w:noProof/>
+        </w:rPr>
         <w:drawing>
           <wp:inline distT="0" distB="0" distL="0" distR="0" wp14:anchorId="13B7B019" wp14:editId="390AABEC">
             <wp:extent cx="5731510" cy="1843405"/>
@@ -414,7 +797,7 @@
                     <pic:cNvPicPr/>
                   </pic:nvPicPr>
                   <pic:blipFill>
-                    <a:blip r:embed="rId14"/>
+                    <a:blip r:embed="rId15"/>
                     <a:stretch>
                       <a:fillRect/>
                     </a:stretch>
@@ -437,6 +820,9 @@
     </w:p>
     <w:p>
       <w:r>
+        <w:rPr>
+          <w:noProof/>
+        </w:rPr>
         <w:drawing>
           <wp:inline distT="0" distB="0" distL="0" distR="0" wp14:anchorId="498FD5F1" wp14:editId="0CFD571D">
             <wp:extent cx="5731510" cy="1718310"/>
@@ -453,7 +839,7 @@
                     <pic:cNvPicPr/>
                   </pic:nvPicPr>
                   <pic:blipFill>
-                    <a:blip r:embed="rId15"/>
+                    <a:blip r:embed="rId16"/>
                     <a:stretch>
                       <a:fillRect/>
                     </a:stretch>
@@ -476,6 +862,9 @@
     </w:p>
     <w:p>
       <w:r>
+        <w:rPr>
+          <w:noProof/>
+        </w:rPr>
         <w:lastRenderedPageBreak/>
         <w:drawing>
           <wp:inline distT="0" distB="0" distL="0" distR="0" wp14:anchorId="548C3D89" wp14:editId="064A60B4">
@@ -493,7 +882,7 @@
                     <pic:cNvPicPr/>
                   </pic:nvPicPr>
                   <pic:blipFill>
-                    <a:blip r:embed="rId16"/>
+                    <a:blip r:embed="rId17"/>
                     <a:stretch>
                       <a:fillRect/>
                     </a:stretch>
@@ -514,6 +903,9 @@
         </w:drawing>
       </w:r>
       <w:r>
+        <w:rPr>
+          <w:noProof/>
+        </w:rPr>
         <w:drawing>
           <wp:inline distT="0" distB="0" distL="0" distR="0" wp14:anchorId="5FFB9EDD" wp14:editId="4269B70B">
             <wp:extent cx="5731510" cy="2686685"/>
@@ -530,7 +922,7 @@
                     <pic:cNvPicPr/>
                   </pic:nvPicPr>
                   <pic:blipFill>
-                    <a:blip r:embed="rId17"/>
+                    <a:blip r:embed="rId18"/>
                     <a:stretch>
                       <a:fillRect/>
                     </a:stretch>
@@ -559,6 +951,435 @@
     </w:sectPr>
   </w:body>
 </w:document>
+</file>
+
+<file path=word/numbering.xml><?xml version="1.0" encoding="utf-8"?>
+<w:numbering xmlns:wpc="http://schemas.microsoft.com/office/word/2010/wordprocessingCanvas" xmlns:cx="http://schemas.microsoft.com/office/drawing/2014/chartex" xmlns:cx1="http://schemas.microsoft.com/office/drawing/2015/9/8/chartex" xmlns:cx2="http://schemas.microsoft.com/office/drawing/2015/10/21/chartex" xmlns:cx3="http://schemas.microsoft.com/office/drawing/2016/5/9/chartex" xmlns:cx4="http://schemas.microsoft.com/office/drawing/2016/5/10/chartex" xmlns:cx5="http://schemas.microsoft.com/office/drawing/2016/5/11/chartex" xmlns:cx6="http://schemas.microsoft.com/office/drawing/2016/5/12/chartex" xmlns:cx7="http://schemas.microsoft.com/office/drawing/2016/5/13/chartex" xmlns:cx8="http://schemas.microsoft.com/office/drawing/2016/5/14/chartex" xmlns:mc="http://schemas.openxmlformats.org/markup-compatibility/2006" xmlns:aink="http://schemas.microsoft.com/office/drawing/2016/ink" xmlns:am3d="http://schemas.microsoft.com/office/drawing/2017/model3d" xmlns:o="urn:schemas-microsoft-com:office:office" xmlns:oel="http://schemas.microsoft.com/office/2019/extlst" xmlns:r="http://schemas.openxmlformats.org/officeDocument/2006/relationships" xmlns:m="http://schemas.openxmlformats.org/officeDocument/2006/math" xmlns:v="urn:schemas-microsoft-com:vml" xmlns:wp14="http://schemas.microsoft.com/office/word/2010/wordprocessingDrawing" xmlns:wp="http://schemas.openxmlformats.org/drawingml/2006/wordprocessingDrawing" xmlns:w10="urn:schemas-microsoft-com:office:word" xmlns:w="http://schemas.openxmlformats.org/wordprocessingml/2006/main" xmlns:w14="http://schemas.microsoft.com/office/word/2010/wordml" xmlns:w15="http://schemas.microsoft.com/office/word/2012/wordml" xmlns:w16cex="http://schemas.microsoft.com/office/word/2018/wordml/cex" xmlns:w16cid="http://schemas.microsoft.com/office/word/2016/wordml/cid" xmlns:w16="http://schemas.microsoft.com/office/word/2018/wordml" xmlns:w16du="http://schemas.microsoft.com/office/word/2023/wordml/word16du" xmlns:w16sdtdh="http://schemas.microsoft.com/office/word/2020/wordml/sdtdatahash" xmlns:w16sdtfl="http://schemas.microsoft.com/office/word/2024/wordml/sdtformatlock" xmlns:w16se="http://schemas.microsoft.com/office/word/2015/wordml/symex" xmlns:wpg="http://schemas.microsoft.com/office/word/2010/wordprocessingGroup" xmlns:wpi="http://schemas.microsoft.com/office/word/2010/wordprocessingInk" xmlns:wne="http://schemas.microsoft.com/office/word/2006/wordml" xmlns:wps="http://schemas.microsoft.com/office/word/2010/wordprocessingShape" mc:Ignorable="w14 w15 w16se w16cid w16 w16cex w16sdtdh w16sdtfl w16du wp14">
+  <w:abstractNum w:abstractNumId="0" w15:restartNumberingAfterBreak="0">
+    <w:nsid w:val="08B379D8"/>
+    <w:multiLevelType w:val="multilevel"/>
+    <w:tmpl w:val="3D48619E"/>
+    <w:lvl w:ilvl="0">
+      <w:start w:val="1"/>
+      <w:numFmt w:val="bullet"/>
+      <w:lvlText w:val=""/>
+      <w:lvlJc w:val="left"/>
+      <w:pPr>
+        <w:tabs>
+          <w:tab w:val="num" w:pos="720"/>
+        </w:tabs>
+        <w:ind w:left="720" w:hanging="360"/>
+      </w:pPr>
+      <w:rPr>
+        <w:rFonts w:ascii="Symbol" w:hAnsi="Symbol" w:hint="default"/>
+        <w:sz w:val="20"/>
+      </w:rPr>
+    </w:lvl>
+    <w:lvl w:ilvl="1" w:tentative="1">
+      <w:start w:val="1"/>
+      <w:numFmt w:val="bullet"/>
+      <w:lvlText w:val="o"/>
+      <w:lvlJc w:val="left"/>
+      <w:pPr>
+        <w:tabs>
+          <w:tab w:val="num" w:pos="1440"/>
+        </w:tabs>
+        <w:ind w:left="1440" w:hanging="360"/>
+      </w:pPr>
+      <w:rPr>
+        <w:rFonts w:ascii="Courier New" w:hAnsi="Courier New" w:hint="default"/>
+        <w:sz w:val="20"/>
+      </w:rPr>
+    </w:lvl>
+    <w:lvl w:ilvl="2" w:tentative="1">
+      <w:start w:val="1"/>
+      <w:numFmt w:val="bullet"/>
+      <w:lvlText w:val=""/>
+      <w:lvlJc w:val="left"/>
+      <w:pPr>
+        <w:tabs>
+          <w:tab w:val="num" w:pos="2160"/>
+        </w:tabs>
+        <w:ind w:left="2160" w:hanging="360"/>
+      </w:pPr>
+      <w:rPr>
+        <w:rFonts w:ascii="Wingdings" w:hAnsi="Wingdings" w:hint="default"/>
+        <w:sz w:val="20"/>
+      </w:rPr>
+    </w:lvl>
+    <w:lvl w:ilvl="3" w:tentative="1">
+      <w:start w:val="1"/>
+      <w:numFmt w:val="bullet"/>
+      <w:lvlText w:val=""/>
+      <w:lvlJc w:val="left"/>
+      <w:pPr>
+        <w:tabs>
+          <w:tab w:val="num" w:pos="2880"/>
+        </w:tabs>
+        <w:ind w:left="2880" w:hanging="360"/>
+      </w:pPr>
+      <w:rPr>
+        <w:rFonts w:ascii="Wingdings" w:hAnsi="Wingdings" w:hint="default"/>
+        <w:sz w:val="20"/>
+      </w:rPr>
+    </w:lvl>
+    <w:lvl w:ilvl="4" w:tentative="1">
+      <w:start w:val="1"/>
+      <w:numFmt w:val="bullet"/>
+      <w:lvlText w:val=""/>
+      <w:lvlJc w:val="left"/>
+      <w:pPr>
+        <w:tabs>
+          <w:tab w:val="num" w:pos="3600"/>
+        </w:tabs>
+        <w:ind w:left="3600" w:hanging="360"/>
+      </w:pPr>
+      <w:rPr>
+        <w:rFonts w:ascii="Wingdings" w:hAnsi="Wingdings" w:hint="default"/>
+        <w:sz w:val="20"/>
+      </w:rPr>
+    </w:lvl>
+    <w:lvl w:ilvl="5" w:tentative="1">
+      <w:start w:val="1"/>
+      <w:numFmt w:val="bullet"/>
+      <w:lvlText w:val=""/>
+      <w:lvlJc w:val="left"/>
+      <w:pPr>
+        <w:tabs>
+          <w:tab w:val="num" w:pos="4320"/>
+        </w:tabs>
+        <w:ind w:left="4320" w:hanging="360"/>
+      </w:pPr>
+      <w:rPr>
+        <w:rFonts w:ascii="Wingdings" w:hAnsi="Wingdings" w:hint="default"/>
+        <w:sz w:val="20"/>
+      </w:rPr>
+    </w:lvl>
+    <w:lvl w:ilvl="6" w:tentative="1">
+      <w:start w:val="1"/>
+      <w:numFmt w:val="bullet"/>
+      <w:lvlText w:val=""/>
+      <w:lvlJc w:val="left"/>
+      <w:pPr>
+        <w:tabs>
+          <w:tab w:val="num" w:pos="5040"/>
+        </w:tabs>
+        <w:ind w:left="5040" w:hanging="360"/>
+      </w:pPr>
+      <w:rPr>
+        <w:rFonts w:ascii="Wingdings" w:hAnsi="Wingdings" w:hint="default"/>
+        <w:sz w:val="20"/>
+      </w:rPr>
+    </w:lvl>
+    <w:lvl w:ilvl="7" w:tentative="1">
+      <w:start w:val="1"/>
+      <w:numFmt w:val="bullet"/>
+      <w:lvlText w:val=""/>
+      <w:lvlJc w:val="left"/>
+      <w:pPr>
+        <w:tabs>
+          <w:tab w:val="num" w:pos="5760"/>
+        </w:tabs>
+        <w:ind w:left="5760" w:hanging="360"/>
+      </w:pPr>
+      <w:rPr>
+        <w:rFonts w:ascii="Wingdings" w:hAnsi="Wingdings" w:hint="default"/>
+        <w:sz w:val="20"/>
+      </w:rPr>
+    </w:lvl>
+    <w:lvl w:ilvl="8" w:tentative="1">
+      <w:start w:val="1"/>
+      <w:numFmt w:val="bullet"/>
+      <w:lvlText w:val=""/>
+      <w:lvlJc w:val="left"/>
+      <w:pPr>
+        <w:tabs>
+          <w:tab w:val="num" w:pos="6480"/>
+        </w:tabs>
+        <w:ind w:left="6480" w:hanging="360"/>
+      </w:pPr>
+      <w:rPr>
+        <w:rFonts w:ascii="Wingdings" w:hAnsi="Wingdings" w:hint="default"/>
+        <w:sz w:val="20"/>
+      </w:rPr>
+    </w:lvl>
+  </w:abstractNum>
+  <w:abstractNum w:abstractNumId="1" w15:restartNumberingAfterBreak="0">
+    <w:nsid w:val="371B4D1B"/>
+    <w:multiLevelType w:val="multilevel"/>
+    <w:tmpl w:val="7F2E8602"/>
+    <w:lvl w:ilvl="0">
+      <w:start w:val="1"/>
+      <w:numFmt w:val="decimal"/>
+      <w:lvlText w:val="%1."/>
+      <w:lvlJc w:val="left"/>
+      <w:pPr>
+        <w:tabs>
+          <w:tab w:val="num" w:pos="720"/>
+        </w:tabs>
+        <w:ind w:left="720" w:hanging="360"/>
+      </w:pPr>
+    </w:lvl>
+    <w:lvl w:ilvl="1">
+      <w:start w:val="1"/>
+      <w:numFmt w:val="bullet"/>
+      <w:lvlText w:val="o"/>
+      <w:lvlJc w:val="left"/>
+      <w:pPr>
+        <w:tabs>
+          <w:tab w:val="num" w:pos="1440"/>
+        </w:tabs>
+        <w:ind w:left="1440" w:hanging="360"/>
+      </w:pPr>
+      <w:rPr>
+        <w:rFonts w:ascii="Courier New" w:hAnsi="Courier New" w:hint="default"/>
+        <w:sz w:val="20"/>
+      </w:rPr>
+    </w:lvl>
+    <w:lvl w:ilvl="2" w:tentative="1">
+      <w:start w:val="1"/>
+      <w:numFmt w:val="decimal"/>
+      <w:lvlText w:val="%3."/>
+      <w:lvlJc w:val="left"/>
+      <w:pPr>
+        <w:tabs>
+          <w:tab w:val="num" w:pos="2160"/>
+        </w:tabs>
+        <w:ind w:left="2160" w:hanging="360"/>
+      </w:pPr>
+    </w:lvl>
+    <w:lvl w:ilvl="3" w:tentative="1">
+      <w:start w:val="1"/>
+      <w:numFmt w:val="decimal"/>
+      <w:lvlText w:val="%4."/>
+      <w:lvlJc w:val="left"/>
+      <w:pPr>
+        <w:tabs>
+          <w:tab w:val="num" w:pos="2880"/>
+        </w:tabs>
+        <w:ind w:left="2880" w:hanging="360"/>
+      </w:pPr>
+    </w:lvl>
+    <w:lvl w:ilvl="4" w:tentative="1">
+      <w:start w:val="1"/>
+      <w:numFmt w:val="decimal"/>
+      <w:lvlText w:val="%5."/>
+      <w:lvlJc w:val="left"/>
+      <w:pPr>
+        <w:tabs>
+          <w:tab w:val="num" w:pos="3600"/>
+        </w:tabs>
+        <w:ind w:left="3600" w:hanging="360"/>
+      </w:pPr>
+    </w:lvl>
+    <w:lvl w:ilvl="5" w:tentative="1">
+      <w:start w:val="1"/>
+      <w:numFmt w:val="decimal"/>
+      <w:lvlText w:val="%6."/>
+      <w:lvlJc w:val="left"/>
+      <w:pPr>
+        <w:tabs>
+          <w:tab w:val="num" w:pos="4320"/>
+        </w:tabs>
+        <w:ind w:left="4320" w:hanging="360"/>
+      </w:pPr>
+    </w:lvl>
+    <w:lvl w:ilvl="6" w:tentative="1">
+      <w:start w:val="1"/>
+      <w:numFmt w:val="decimal"/>
+      <w:lvlText w:val="%7."/>
+      <w:lvlJc w:val="left"/>
+      <w:pPr>
+        <w:tabs>
+          <w:tab w:val="num" w:pos="5040"/>
+        </w:tabs>
+        <w:ind w:left="5040" w:hanging="360"/>
+      </w:pPr>
+    </w:lvl>
+    <w:lvl w:ilvl="7" w:tentative="1">
+      <w:start w:val="1"/>
+      <w:numFmt w:val="decimal"/>
+      <w:lvlText w:val="%8."/>
+      <w:lvlJc w:val="left"/>
+      <w:pPr>
+        <w:tabs>
+          <w:tab w:val="num" w:pos="5760"/>
+        </w:tabs>
+        <w:ind w:left="5760" w:hanging="360"/>
+      </w:pPr>
+    </w:lvl>
+    <w:lvl w:ilvl="8" w:tentative="1">
+      <w:start w:val="1"/>
+      <w:numFmt w:val="decimal"/>
+      <w:lvlText w:val="%9."/>
+      <w:lvlJc w:val="left"/>
+      <w:pPr>
+        <w:tabs>
+          <w:tab w:val="num" w:pos="6480"/>
+        </w:tabs>
+        <w:ind w:left="6480" w:hanging="360"/>
+      </w:pPr>
+    </w:lvl>
+  </w:abstractNum>
+  <w:abstractNum w:abstractNumId="2" w15:restartNumberingAfterBreak="0">
+    <w:nsid w:val="6AE63E20"/>
+    <w:multiLevelType w:val="multilevel"/>
+    <w:tmpl w:val="3F62EC44"/>
+    <w:lvl w:ilvl="0">
+      <w:start w:val="1"/>
+      <w:numFmt w:val="bullet"/>
+      <w:lvlText w:val=""/>
+      <w:lvlJc w:val="left"/>
+      <w:pPr>
+        <w:tabs>
+          <w:tab w:val="num" w:pos="720"/>
+        </w:tabs>
+        <w:ind w:left="720" w:hanging="360"/>
+      </w:pPr>
+      <w:rPr>
+        <w:rFonts w:ascii="Symbol" w:hAnsi="Symbol" w:hint="default"/>
+        <w:sz w:val="20"/>
+      </w:rPr>
+    </w:lvl>
+    <w:lvl w:ilvl="1" w:tentative="1">
+      <w:start w:val="1"/>
+      <w:numFmt w:val="bullet"/>
+      <w:lvlText w:val="o"/>
+      <w:lvlJc w:val="left"/>
+      <w:pPr>
+        <w:tabs>
+          <w:tab w:val="num" w:pos="1440"/>
+        </w:tabs>
+        <w:ind w:left="1440" w:hanging="360"/>
+      </w:pPr>
+      <w:rPr>
+        <w:rFonts w:ascii="Courier New" w:hAnsi="Courier New" w:hint="default"/>
+        <w:sz w:val="20"/>
+      </w:rPr>
+    </w:lvl>
+    <w:lvl w:ilvl="2" w:tentative="1">
+      <w:start w:val="1"/>
+      <w:numFmt w:val="bullet"/>
+      <w:lvlText w:val=""/>
+      <w:lvlJc w:val="left"/>
+      <w:pPr>
+        <w:tabs>
+          <w:tab w:val="num" w:pos="2160"/>
+        </w:tabs>
+        <w:ind w:left="2160" w:hanging="360"/>
+      </w:pPr>
+      <w:rPr>
+        <w:rFonts w:ascii="Wingdings" w:hAnsi="Wingdings" w:hint="default"/>
+        <w:sz w:val="20"/>
+      </w:rPr>
+    </w:lvl>
+    <w:lvl w:ilvl="3" w:tentative="1">
+      <w:start w:val="1"/>
+      <w:numFmt w:val="bullet"/>
+      <w:lvlText w:val=""/>
+      <w:lvlJc w:val="left"/>
+      <w:pPr>
+        <w:tabs>
+          <w:tab w:val="num" w:pos="2880"/>
+        </w:tabs>
+        <w:ind w:left="2880" w:hanging="360"/>
+      </w:pPr>
+      <w:rPr>
+        <w:rFonts w:ascii="Wingdings" w:hAnsi="Wingdings" w:hint="default"/>
+        <w:sz w:val="20"/>
+      </w:rPr>
+    </w:lvl>
+    <w:lvl w:ilvl="4" w:tentative="1">
+      <w:start w:val="1"/>
+      <w:numFmt w:val="bullet"/>
+      <w:lvlText w:val=""/>
+      <w:lvlJc w:val="left"/>
+      <w:pPr>
+        <w:tabs>
+          <w:tab w:val="num" w:pos="3600"/>
+        </w:tabs>
+        <w:ind w:left="3600" w:hanging="360"/>
+      </w:pPr>
+      <w:rPr>
+        <w:rFonts w:ascii="Wingdings" w:hAnsi="Wingdings" w:hint="default"/>
+        <w:sz w:val="20"/>
+      </w:rPr>
+    </w:lvl>
+    <w:lvl w:ilvl="5" w:tentative="1">
+      <w:start w:val="1"/>
+      <w:numFmt w:val="bullet"/>
+      <w:lvlText w:val=""/>
+      <w:lvlJc w:val="left"/>
+      <w:pPr>
+        <w:tabs>
+          <w:tab w:val="num" w:pos="4320"/>
+        </w:tabs>
+        <w:ind w:left="4320" w:hanging="360"/>
+      </w:pPr>
+      <w:rPr>
+        <w:rFonts w:ascii="Wingdings" w:hAnsi="Wingdings" w:hint="default"/>
+        <w:sz w:val="20"/>
+      </w:rPr>
+    </w:lvl>
+    <w:lvl w:ilvl="6" w:tentative="1">
+      <w:start w:val="1"/>
+      <w:numFmt w:val="bullet"/>
+      <w:lvlText w:val=""/>
+      <w:lvlJc w:val="left"/>
+      <w:pPr>
+        <w:tabs>
+          <w:tab w:val="num" w:pos="5040"/>
+        </w:tabs>
+        <w:ind w:left="5040" w:hanging="360"/>
+      </w:pPr>
+      <w:rPr>
+        <w:rFonts w:ascii="Wingdings" w:hAnsi="Wingdings" w:hint="default"/>
+        <w:sz w:val="20"/>
+      </w:rPr>
+    </w:lvl>
+    <w:lvl w:ilvl="7" w:tentative="1">
+      <w:start w:val="1"/>
+      <w:numFmt w:val="bullet"/>
+      <w:lvlText w:val=""/>
+      <w:lvlJc w:val="left"/>
+      <w:pPr>
+        <w:tabs>
+          <w:tab w:val="num" w:pos="5760"/>
+        </w:tabs>
+        <w:ind w:left="5760" w:hanging="360"/>
+      </w:pPr>
+      <w:rPr>
+        <w:rFonts w:ascii="Wingdings" w:hAnsi="Wingdings" w:hint="default"/>
+        <w:sz w:val="20"/>
+      </w:rPr>
+    </w:lvl>
+    <w:lvl w:ilvl="8" w:tentative="1">
+      <w:start w:val="1"/>
+      <w:numFmt w:val="bullet"/>
+      <w:lvlText w:val=""/>
+      <w:lvlJc w:val="left"/>
+      <w:pPr>
+        <w:tabs>
+          <w:tab w:val="num" w:pos="6480"/>
+        </w:tabs>
+        <w:ind w:left="6480" w:hanging="360"/>
+      </w:pPr>
+      <w:rPr>
+        <w:rFonts w:ascii="Wingdings" w:hAnsi="Wingdings" w:hint="default"/>
+        <w:sz w:val="20"/>
+      </w:rPr>
+    </w:lvl>
+  </w:abstractNum>
+  <w:num w:numId="1" w16cid:durableId="1298413816">
+    <w:abstractNumId w:val="2"/>
+  </w:num>
+  <w:num w:numId="2" w16cid:durableId="798182992">
+    <w:abstractNumId w:val="1"/>
+  </w:num>
+  <w:num w:numId="3" w16cid:durableId="873882817">
+    <w:abstractNumId w:val="0"/>
+  </w:num>
+</w:numbering>
 </file>
 
 <file path=word/styles.xml><?xml version="1.0" encoding="utf-8"?>
@@ -1164,7 +1985,6 @@
   <w:style w:type="character" w:default="1" w:styleId="DefaultParagraphFont">
     <w:name w:val="Default Paragraph Font"/>
     <w:uiPriority w:val="1"/>
-    <w:semiHidden/>
     <w:unhideWhenUsed/>
   </w:style>
   <w:style w:type="table" w:default="1" w:styleId="TableNormal">

</xml_diff>